<commit_message>
Add curate_evalset script to evalset file list
Updates the teleprompter content to include `04-evaluate/curate_evalset.py` in the evalset curation block, clarifying that this script preserves the key tool per turn. The same guidance was synced in the markdown and corresponding docx planning/teleprompter documents.
</commit_message>
<xml_diff>
--- a/docs/TELEPROMPTER - AgentOps on Google Cloud.docx
+++ b/docs/TELEPROMPTER - AgentOps on Google Cloud.docx
@@ -6224,6 +6224,37 @@
           <w:szCs w:val="18"/>
         </w:rPr>
         <w:t xml:space="preserve">   what this block creates</w:t>
+      </w:r>
+    </w:p>
+    <w:p>
+      <w:pPr>
+        <w:spacing w:after="0" w:before="0" w:line="264"/>
+      </w:pPr>
+      <w:r>
+        <w:rPr>
+          <w:rFonts w:ascii="Consolas" w:cs="Consolas" w:eastAsia="Consolas" w:hAnsi="Consolas"/>
+          <w:b w:val="false"/>
+          <w:bCs w:val="false"/>
+          <w:i w:val="false"/>
+          <w:iCs w:val="false"/>
+          <w:color w:val="B07CFF"/>
+          <w:sz w:val="19"/>
+          <w:szCs w:val="19"/>
+        </w:rPr>
+        <w:t xml:space="preserve">04-evaluate/curate_evalset.py</w:t>
+      </w:r>
+      <w:r>
+        <w:rPr>
+          <w:rFonts w:ascii="Calibri" w:cs="Calibri" w:eastAsia="Calibri" w:hAnsi="Calibri"/>
+          <w:b w:val="false"/>
+          <w:bCs w:val="false"/>
+          <w:i w:val="false"/>
+          <w:iCs w:val="false"/>
+          <w:color w:val="9AA4B2"/>
+          <w:sz w:val="18"/>
+          <w:szCs w:val="18"/>
+        </w:rPr>
+        <w:t xml:space="preserve">   keeps the key tool per turn</w:t>
       </w:r>
     </w:p>
     <w:p>

</xml_diff>